<commit_message>
fix: enable temperature/top_p in LLM calls, add r3agentv3 agent and evaluation scripts
Co-Authored-By: Claude Sonnet 4.6 (1M context) <noreply@anthropic.com>
</commit_message>
<xml_diff>
--- a/assets/libreoffice_writ_njc/0348a68c-a33e-47e9-9e07-d189c43e9bec/Meeting_L2_03.docx
+++ b/assets/libreoffice_writ_njc/0348a68c-a33e-47e9-9e07-d189c43e9bec/Meeting_L2_03.docx
@@ -194,7 +194,7 @@
       </w:pPr>
       <w:r>
         <w:rPr/>
-        <w:t>Summary: All Q1 targets were met or exceeded. The team will focus on scaling operations and executing the Q2 product roadmap. Next review meeting scheduled for April 25.</w:t>
+        <w:t>Summary: All Q1 targets were met or exceeded. The team will focus on scaling operations and executing the Q2 product roadmap. Next review meeting scheduled for April 25..</w:t>
       </w:r>
     </w:p>
     <w:sectPr>
@@ -239,6 +239,7 @@
         </w:tabs>
         <w:ind w:left="1080" w:hanging="360"/>
       </w:pPr>
+      <w:rPr/>
     </w:lvl>
     <w:lvl w:ilvl="2">
       <w:start w:val="1"/>
@@ -251,6 +252,7 @@
         </w:tabs>
         <w:ind w:left="1440" w:hanging="360"/>
       </w:pPr>
+      <w:rPr/>
     </w:lvl>
     <w:lvl w:ilvl="3">
       <w:start w:val="1"/>
@@ -263,6 +265,7 @@
         </w:tabs>
         <w:ind w:left="1800" w:hanging="360"/>
       </w:pPr>
+      <w:rPr/>
     </w:lvl>
     <w:lvl w:ilvl="4">
       <w:start w:val="1"/>
@@ -275,6 +278,7 @@
         </w:tabs>
         <w:ind w:left="2160" w:hanging="360"/>
       </w:pPr>
+      <w:rPr/>
     </w:lvl>
     <w:lvl w:ilvl="5">
       <w:start w:val="1"/>
@@ -287,6 +291,7 @@
         </w:tabs>
         <w:ind w:left="2520" w:hanging="360"/>
       </w:pPr>
+      <w:rPr/>
     </w:lvl>
     <w:lvl w:ilvl="6">
       <w:start w:val="1"/>
@@ -299,6 +304,7 @@
         </w:tabs>
         <w:ind w:left="2880" w:hanging="360"/>
       </w:pPr>
+      <w:rPr/>
     </w:lvl>
     <w:lvl w:ilvl="7">
       <w:start w:val="1"/>
@@ -311,6 +317,7 @@
         </w:tabs>
         <w:ind w:left="3240" w:hanging="360"/>
       </w:pPr>
+      <w:rPr/>
     </w:lvl>
     <w:lvl w:ilvl="8">
       <w:start w:val="1"/>
@@ -323,6 +330,7 @@
         </w:tabs>
         <w:ind w:left="3600" w:hanging="360"/>
       </w:pPr>
+      <w:rPr/>
     </w:lvl>
   </w:abstractNum>
   <w:abstractNum w:abstractNumId="2">
@@ -352,6 +360,7 @@
         </w:tabs>
         <w:ind w:left="1080" w:hanging="360"/>
       </w:pPr>
+      <w:rPr/>
     </w:lvl>
     <w:lvl w:ilvl="2">
       <w:start w:val="1"/>
@@ -364,6 +373,7 @@
         </w:tabs>
         <w:ind w:left="1440" w:hanging="360"/>
       </w:pPr>
+      <w:rPr/>
     </w:lvl>
     <w:lvl w:ilvl="3">
       <w:start w:val="1"/>
@@ -376,6 +386,7 @@
         </w:tabs>
         <w:ind w:left="1800" w:hanging="360"/>
       </w:pPr>
+      <w:rPr/>
     </w:lvl>
     <w:lvl w:ilvl="4">
       <w:start w:val="1"/>
@@ -388,6 +399,7 @@
         </w:tabs>
         <w:ind w:left="2160" w:hanging="360"/>
       </w:pPr>
+      <w:rPr/>
     </w:lvl>
     <w:lvl w:ilvl="5">
       <w:start w:val="1"/>
@@ -400,6 +412,7 @@
         </w:tabs>
         <w:ind w:left="2520" w:hanging="360"/>
       </w:pPr>
+      <w:rPr/>
     </w:lvl>
     <w:lvl w:ilvl="6">
       <w:start w:val="1"/>
@@ -412,6 +425,7 @@
         </w:tabs>
         <w:ind w:left="2880" w:hanging="360"/>
       </w:pPr>
+      <w:rPr/>
     </w:lvl>
     <w:lvl w:ilvl="7">
       <w:start w:val="1"/>
@@ -424,6 +438,7 @@
         </w:tabs>
         <w:ind w:left="3240" w:hanging="360"/>
       </w:pPr>
+      <w:rPr/>
     </w:lvl>
     <w:lvl w:ilvl="8">
       <w:start w:val="1"/>
@@ -436,6 +451,7 @@
         </w:tabs>
         <w:ind w:left="3600" w:hanging="360"/>
       </w:pPr>
+      <w:rPr/>
     </w:lvl>
   </w:abstractNum>
   <w:abstractNum w:abstractNumId="3">
@@ -465,6 +481,7 @@
         </w:tabs>
         <w:ind w:left="1080" w:hanging="360"/>
       </w:pPr>
+      <w:rPr/>
     </w:lvl>
     <w:lvl w:ilvl="2">
       <w:start w:val="1"/>
@@ -477,6 +494,7 @@
         </w:tabs>
         <w:ind w:left="1440" w:hanging="360"/>
       </w:pPr>
+      <w:rPr/>
     </w:lvl>
     <w:lvl w:ilvl="3">
       <w:start w:val="1"/>
@@ -489,6 +507,7 @@
         </w:tabs>
         <w:ind w:left="1800" w:hanging="360"/>
       </w:pPr>
+      <w:rPr/>
     </w:lvl>
     <w:lvl w:ilvl="4">
       <w:start w:val="1"/>
@@ -501,6 +520,7 @@
         </w:tabs>
         <w:ind w:left="2160" w:hanging="360"/>
       </w:pPr>
+      <w:rPr/>
     </w:lvl>
     <w:lvl w:ilvl="5">
       <w:start w:val="1"/>
@@ -513,6 +533,7 @@
         </w:tabs>
         <w:ind w:left="2520" w:hanging="360"/>
       </w:pPr>
+      <w:rPr/>
     </w:lvl>
     <w:lvl w:ilvl="6">
       <w:start w:val="1"/>
@@ -525,6 +546,7 @@
         </w:tabs>
         <w:ind w:left="2880" w:hanging="360"/>
       </w:pPr>
+      <w:rPr/>
     </w:lvl>
     <w:lvl w:ilvl="7">
       <w:start w:val="1"/>
@@ -537,6 +559,7 @@
         </w:tabs>
         <w:ind w:left="3240" w:hanging="360"/>
       </w:pPr>
+      <w:rPr/>
     </w:lvl>
     <w:lvl w:ilvl="8">
       <w:start w:val="1"/>
@@ -549,6 +572,7 @@
         </w:tabs>
         <w:ind w:left="3600" w:hanging="360"/>
       </w:pPr>
+      <w:rPr/>
     </w:lvl>
   </w:abstractNum>
   <w:abstractNum w:abstractNumId="4">
@@ -576,6 +600,7 @@
         </w:tabs>
         <w:ind w:left="1080" w:hanging="360"/>
       </w:pPr>
+      <w:rPr/>
     </w:lvl>
     <w:lvl w:ilvl="2">
       <w:start w:val="1"/>
@@ -588,6 +613,7 @@
         </w:tabs>
         <w:ind w:left="1440" w:hanging="360"/>
       </w:pPr>
+      <w:rPr/>
     </w:lvl>
     <w:lvl w:ilvl="3">
       <w:start w:val="1"/>
@@ -600,6 +626,7 @@
         </w:tabs>
         <w:ind w:left="1800" w:hanging="360"/>
       </w:pPr>
+      <w:rPr/>
     </w:lvl>
     <w:lvl w:ilvl="4">
       <w:start w:val="1"/>
@@ -612,6 +639,7 @@
         </w:tabs>
         <w:ind w:left="2160" w:hanging="360"/>
       </w:pPr>
+      <w:rPr/>
     </w:lvl>
     <w:lvl w:ilvl="5">
       <w:start w:val="1"/>
@@ -624,6 +652,7 @@
         </w:tabs>
         <w:ind w:left="2520" w:hanging="360"/>
       </w:pPr>
+      <w:rPr/>
     </w:lvl>
     <w:lvl w:ilvl="6">
       <w:start w:val="1"/>
@@ -636,6 +665,7 @@
         </w:tabs>
         <w:ind w:left="2880" w:hanging="360"/>
       </w:pPr>
+      <w:rPr/>
     </w:lvl>
     <w:lvl w:ilvl="7">
       <w:start w:val="1"/>
@@ -648,6 +678,7 @@
         </w:tabs>
         <w:ind w:left="3240" w:hanging="360"/>
       </w:pPr>
+      <w:rPr/>
     </w:lvl>
     <w:lvl w:ilvl="8">
       <w:start w:val="1"/>
@@ -660,6 +691,7 @@
         </w:tabs>
         <w:ind w:left="3600" w:hanging="360"/>
       </w:pPr>
+      <w:rPr/>
     </w:lvl>
   </w:abstractNum>
   <w:abstractNum w:abstractNumId="5">
@@ -687,6 +719,7 @@
         </w:tabs>
         <w:ind w:left="1080" w:hanging="360"/>
       </w:pPr>
+      <w:rPr/>
     </w:lvl>
     <w:lvl w:ilvl="2">
       <w:start w:val="1"/>
@@ -699,6 +732,7 @@
         </w:tabs>
         <w:ind w:left="1440" w:hanging="360"/>
       </w:pPr>
+      <w:rPr/>
     </w:lvl>
     <w:lvl w:ilvl="3">
       <w:start w:val="1"/>
@@ -711,6 +745,7 @@
         </w:tabs>
         <w:ind w:left="1800" w:hanging="360"/>
       </w:pPr>
+      <w:rPr/>
     </w:lvl>
     <w:lvl w:ilvl="4">
       <w:start w:val="1"/>
@@ -723,6 +758,7 @@
         </w:tabs>
         <w:ind w:left="2160" w:hanging="360"/>
       </w:pPr>
+      <w:rPr/>
     </w:lvl>
     <w:lvl w:ilvl="5">
       <w:start w:val="1"/>
@@ -735,6 +771,7 @@
         </w:tabs>
         <w:ind w:left="2520" w:hanging="360"/>
       </w:pPr>
+      <w:rPr/>
     </w:lvl>
     <w:lvl w:ilvl="6">
       <w:start w:val="1"/>
@@ -747,6 +784,7 @@
         </w:tabs>
         <w:ind w:left="2880" w:hanging="360"/>
       </w:pPr>
+      <w:rPr/>
     </w:lvl>
     <w:lvl w:ilvl="7">
       <w:start w:val="1"/>
@@ -759,6 +797,7 @@
         </w:tabs>
         <w:ind w:left="3240" w:hanging="360"/>
       </w:pPr>
+      <w:rPr/>
     </w:lvl>
     <w:lvl w:ilvl="8">
       <w:start w:val="1"/>
@@ -771,6 +810,7 @@
         </w:tabs>
         <w:ind w:left="3600" w:hanging="360"/>
       </w:pPr>
+      <w:rPr/>
     </w:lvl>
   </w:abstractNum>
   <w:abstractNum w:abstractNumId="6">
@@ -798,6 +838,7 @@
         </w:tabs>
         <w:ind w:left="1080" w:hanging="360"/>
       </w:pPr>
+      <w:rPr/>
     </w:lvl>
     <w:lvl w:ilvl="2">
       <w:start w:val="1"/>
@@ -810,6 +851,7 @@
         </w:tabs>
         <w:ind w:left="1440" w:hanging="360"/>
       </w:pPr>
+      <w:rPr/>
     </w:lvl>
     <w:lvl w:ilvl="3">
       <w:start w:val="1"/>
@@ -822,6 +864,7 @@
         </w:tabs>
         <w:ind w:left="1800" w:hanging="360"/>
       </w:pPr>
+      <w:rPr/>
     </w:lvl>
     <w:lvl w:ilvl="4">
       <w:start w:val="1"/>
@@ -834,6 +877,7 @@
         </w:tabs>
         <w:ind w:left="2160" w:hanging="360"/>
       </w:pPr>
+      <w:rPr/>
     </w:lvl>
     <w:lvl w:ilvl="5">
       <w:start w:val="1"/>
@@ -846,6 +890,7 @@
         </w:tabs>
         <w:ind w:left="2520" w:hanging="360"/>
       </w:pPr>
+      <w:rPr/>
     </w:lvl>
     <w:lvl w:ilvl="6">
       <w:start w:val="1"/>
@@ -858,6 +903,7 @@
         </w:tabs>
         <w:ind w:left="2880" w:hanging="360"/>
       </w:pPr>
+      <w:rPr/>
     </w:lvl>
     <w:lvl w:ilvl="7">
       <w:start w:val="1"/>
@@ -870,6 +916,7 @@
         </w:tabs>
         <w:ind w:left="3240" w:hanging="360"/>
       </w:pPr>
+      <w:rPr/>
     </w:lvl>
     <w:lvl w:ilvl="8">
       <w:start w:val="1"/>
@@ -882,6 +929,7 @@
         </w:tabs>
         <w:ind w:left="3600" w:hanging="360"/>
       </w:pPr>
+      <w:rPr/>
     </w:lvl>
   </w:abstractNum>
   <w:abstractNum w:abstractNumId="7">
@@ -1189,6 +1237,7 @@
     <w:rsid w:val="00fc693f"/>
     <w:pPr>
       <w:widowControl/>
+      <w:suppressAutoHyphens w:val="true"/>
       <w:bidi w:val="0"/>
       <w:spacing w:lineRule="auto" w:line="276" w:before="0" w:after="200"/>
       <w:jc w:val="left"/>
@@ -1881,6 +1930,7 @@
     <w:rsid w:val="00fc693f"/>
     <w:pPr>
       <w:widowControl/>
+      <w:suppressAutoHyphens w:val="true"/>
       <w:bidi w:val="0"/>
       <w:spacing w:lineRule="auto" w:line="240" w:before="0" w:after="0"/>
       <w:jc w:val="left"/>
@@ -1979,24 +2029,29 @@
       <w:szCs w:val="16"/>
     </w:rPr>
   </w:style>
-  <w:style w:type="paragraph" w:styleId="List2">
+  <w:style w:type="paragraph" w:styleId="ListBullet3">
     <w:name w:val="List Bullet 3"/>
     <w:basedOn w:val="Normal"/>
     <w:uiPriority w:val="99"/>
     <w:unhideWhenUsed/>
+    <w:qFormat/>
     <w:rsid w:val="00326f90"/>
     <w:pPr>
+      <w:numPr>
+        <w:ilvl w:val="0"/>
+        <w:numId w:val="3"/>
+      </w:numPr>
       <w:spacing w:before="0" w:after="200"/>
-      <w:ind w:left="720" w:hanging="360"/>
       <w:contextualSpacing/>
     </w:pPr>
     <w:rPr/>
   </w:style>
-  <w:style w:type="paragraph" w:styleId="List3">
+  <w:style w:type="paragraph" w:styleId="ListBullet4">
     <w:name w:val="List Bullet 4"/>
     <w:basedOn w:val="Normal"/>
     <w:uiPriority w:val="99"/>
     <w:unhideWhenUsed/>
+    <w:qFormat/>
     <w:rsid w:val="00326f90"/>
     <w:pPr>
       <w:spacing w:before="0" w:after="200"/>
@@ -2033,23 +2088,6 @@
       <w:numPr>
         <w:ilvl w:val="0"/>
         <w:numId w:val="2"/>
-      </w:numPr>
-      <w:spacing w:before="0" w:after="200"/>
-      <w:contextualSpacing/>
-    </w:pPr>
-    <w:rPr/>
-  </w:style>
-  <w:style w:type="paragraph" w:styleId="ListBullet3">
-    <w:name w:val="List Bullet 3"/>
-    <w:basedOn w:val="Normal"/>
-    <w:uiPriority w:val="99"/>
-    <w:unhideWhenUsed/>
-    <w:qFormat/>
-    <w:rsid w:val="00326f90"/>
-    <w:pPr>
-      <w:numPr>
-        <w:ilvl w:val="0"/>
-        <w:numId w:val="3"/>
       </w:numPr>
       <w:spacing w:before="0" w:after="200"/>
       <w:contextualSpacing/>
@@ -2168,6 +2206,7 @@
         <w:tab w:val="left" w:pos="3456" w:leader="none"/>
         <w:tab w:val="left" w:pos="4032" w:leader="none"/>
       </w:tabs>
+      <w:suppressAutoHyphens w:val="true"/>
       <w:bidi w:val="0"/>
       <w:spacing w:lineRule="auto" w:line="276" w:before="0" w:after="200"/>
       <w:jc w:val="left"/>

</xml_diff>